<commit_message>
fix(resume): absolute contact hrefs + regenerate all resumes
Regenerates resume/resume2/resume3/resume4 through the fixed generator so
they pick up the skills-label rendering fix.

Also fixes a contact-link bug surfaced by that regeneration: resume/resume2/
resume3 write contacts as markdown links (`GitHub: [github.com/ralyodio](
https://github.com/ralyodio)`). stripInlineMarkdown keeps the link text and
discards the URL, so generateContactHTML emitted href="github.com/ralyodio" —
protocol-less, i.e. a broken relative link in the HTML and PDF. The href is
now recovered from the original markdown, and bare hosts get https://
prepended. resume4/resume5 were unaffected (they use bare URLs).

Verified across all five: 0 stray bold markers, 0 relative hrefs,
resume5 still one page.

Note: resume2/resume3 previously had no committed .html; the generator
writes HTML as the PDF source, so those are added here.

Co-Authored-By: Claude Opus 4.8 <noreply@anthropic.com>
</commit_message>
<xml_diff>
--- a/anthony.ettinger.resume.docx
+++ b/anthony.ettinger.resume.docx
@@ -10,7 +10,7 @@
         <w:t xml:space="preserve">Anthony Ettinger - Resume</w:t>
       </w:r>
     </w:p>
-    <w:bookmarkStart w:id="20" w:name="areas-of-expertise"/>
+    <w:bookmarkStart w:id="9" w:name="areas-of-expertise"/>
     <w:p>
       <w:pPr>
         <w:pStyle w:val="Heading2"/>
@@ -54,29 +54,21 @@
         <w:t xml:space="preserve"> </w:t>
       </w:r>
       <w:r>
-        <w:t xml:space="preserve">roadmap definition</w:t>
-      </w:r>
-      <w:r>
-        <w:t xml:space="preserve"> </w:t>
-      </w:r>
-      <w:r>
-        <w:t xml:space="preserve">mentoring</w:t>
-      </w:r>
-      <w:r>
-        <w:t xml:space="preserve"> </w:t>
-      </w:r>
-      <w:r>
-        <w:t xml:space="preserve">code quality</w:t>
-      </w:r>
-      <w:r>
-        <w:t xml:space="preserve"> </w:t>
-      </w:r>
-      <w:r>
-        <w:t xml:space="preserve">and standards</w:t>
-      </w:r>
-    </w:p>
-    <w:bookmarkEnd w:id="20"/>
-    <w:bookmarkStart w:id="21" w:name="technical-skills"/>
+        <w:rPr>
+          <w:b/>
+          <w:bCs/>
+        </w:rPr>
+        <w:t xml:space="preserve">Technical leadership:</w:t>
+      </w:r>
+      <w:r>
+        <w:t xml:space="preserve"> </w:t>
+      </w:r>
+      <w:r>
+        <w:t xml:space="preserve">roadmap definition, mentoring, code quality, and standards</w:t>
+      </w:r>
+    </w:p>
+    <w:bookmarkEnd w:id="9"/>
+    <w:bookmarkStart w:id="10" w:name="technical-skills"/>
     <w:p>
       <w:pPr>
         <w:pStyle w:val="Heading2"/>
@@ -90,209 +82,133 @@
         <w:pStyle w:val="FirstParagraph"/>
       </w:pPr>
       <w:r>
-        <w:t xml:space="preserve">JavaScript/Node.js/TypeScript</w:t>
-      </w:r>
-      <w:r>
-        <w:t xml:space="preserve"> </w:t>
-      </w:r>
-      <w:r>
-        <w:t xml:space="preserve">HTML</w:t>
-      </w:r>
-      <w:r>
-        <w:t xml:space="preserve"> </w:t>
-      </w:r>
-      <w:r>
-        <w:t xml:space="preserve">CSS</w:t>
-      </w:r>
-      <w:r>
-        <w:t xml:space="preserve"> </w:t>
-      </w:r>
-      <w:r>
-        <w:t xml:space="preserve">Svelte/SvelteKit</w:t>
-      </w:r>
-      <w:r>
-        <w:t xml:space="preserve"> </w:t>
-      </w:r>
-      <w:r>
-        <w:t xml:space="preserve">React</w:t>
-      </w:r>
-      <w:r>
-        <w:t xml:space="preserve"> </w:t>
-      </w:r>
-      <w:r>
-        <w:t xml:space="preserve">TypeScript/JavaScript</w:t>
-      </w:r>
-      <w:r>
-        <w:t xml:space="preserve"> </w:t>
-      </w:r>
-      <w:r>
-        <w:t xml:space="preserve">Accessibility (a11y)</w:t>
-      </w:r>
-      <w:r>
-        <w:t xml:space="preserve"> </w:t>
-      </w:r>
-      <w:r>
-        <w:t xml:space="preserve">Express</w:t>
-      </w:r>
-      <w:r>
-        <w:t xml:space="preserve"> </w:t>
-      </w:r>
-      <w:r>
-        <w:t xml:space="preserve">Fastify</w:t>
-      </w:r>
-      <w:r>
-        <w:t xml:space="preserve"> </w:t>
-      </w:r>
-      <w:r>
-        <w:t xml:space="preserve">REST APIs</w:t>
-      </w:r>
-      <w:r>
-        <w:t xml:space="preserve"> </w:t>
-      </w:r>
-      <w:r>
-        <w:t xml:space="preserve">Webhooks</w:t>
-      </w:r>
-      <w:r>
-        <w:t xml:space="preserve"> </w:t>
-      </w:r>
-      <w:r>
-        <w:t xml:space="preserve">MongoDB</w:t>
-      </w:r>
-      <w:r>
-        <w:t xml:space="preserve"> </w:t>
-      </w:r>
-      <w:r>
-        <w:t xml:space="preserve">PostgreSQL</w:t>
-      </w:r>
-      <w:r>
-        <w:t xml:space="preserve"> </w:t>
-      </w:r>
-      <w:r>
-        <w:t xml:space="preserve">Supabase</w:t>
-      </w:r>
-      <w:r>
-        <w:t xml:space="preserve"> </w:t>
-      </w:r>
-      <w:r>
-        <w:t xml:space="preserve">JSON/CSV pipelines</w:t>
-      </w:r>
-      <w:r>
-        <w:t xml:space="preserve"> </w:t>
-      </w:r>
-      <w:r>
-        <w:t xml:space="preserve">Docker</w:t>
-      </w:r>
-      <w:r>
-        <w:t xml:space="preserve"> </w:t>
-      </w:r>
-      <w:r>
-        <w:t xml:space="preserve">GitHub Actions</w:t>
-      </w:r>
-      <w:r>
-        <w:t xml:space="preserve"> </w:t>
-      </w:r>
-      <w:r>
-        <w:t xml:space="preserve">Ubuntu</w:t>
-      </w:r>
-      <w:r>
-        <w:t xml:space="preserve"> </w:t>
-      </w:r>
-      <w:r>
-        <w:t xml:space="preserve">NGINX</w:t>
-      </w:r>
-      <w:r>
-        <w:t xml:space="preserve"> </w:t>
-      </w:r>
-      <w:r>
-        <w:t xml:space="preserve">pm2</w:t>
-      </w:r>
-      <w:r>
-        <w:t xml:space="preserve"> </w:t>
-      </w:r>
-      <w:r>
-        <w:t xml:space="preserve">Chai</w:t>
-      </w:r>
-      <w:r>
-        <w:t xml:space="preserve"> </w:t>
-      </w:r>
-      <w:r>
-        <w:t xml:space="preserve">Karma</w:t>
-      </w:r>
-      <w:r>
-        <w:t xml:space="preserve"> </w:t>
-      </w:r>
-      <w:r>
-        <w:t xml:space="preserve">Protractor; component patterns; E2E/testable UIs</w:t>
-      </w:r>
-      <w:r>
-        <w:t xml:space="preserve"> </w:t>
-      </w:r>
-      <w:r>
-        <w:t xml:space="preserve">Polygon</w:t>
-      </w:r>
-      <w:r>
-        <w:t xml:space="preserve"> </w:t>
-      </w:r>
-      <w:r>
-        <w:t xml:space="preserve">Ethers.js/web3</w:t>
-      </w:r>
-      <w:r>
-        <w:t xml:space="preserve"> </w:t>
-      </w:r>
-      <w:r>
-        <w:t xml:space="preserve">NFT utilities</w:t>
-      </w:r>
-      <w:r>
-        <w:t xml:space="preserve"> </w:t>
-      </w:r>
-      <w:r>
-        <w:t xml:space="preserve">wallet integrations</w:t>
-      </w:r>
-      <w:r>
-        <w:t xml:space="preserve"> </w:t>
-      </w:r>
-      <w:r>
-        <w:t xml:space="preserve">WindSurf</w:t>
-      </w:r>
-      <w:r>
-        <w:t xml:space="preserve"> </w:t>
-      </w:r>
-      <w:r>
-        <w:t xml:space="preserve">RooCode</w:t>
-      </w:r>
-      <w:r>
-        <w:t xml:space="preserve"> </w:t>
-      </w:r>
-      <w:r>
-        <w:t xml:space="preserve">Cursor</w:t>
-      </w:r>
-      <w:r>
-        <w:t xml:space="preserve"> </w:t>
-      </w:r>
-      <w:r>
-        <w:t xml:space="preserve">GitHub Copilot</w:t>
-      </w:r>
-      <w:r>
-        <w:t xml:space="preserve"> </w:t>
-      </w:r>
-      <w:r>
-        <w:t xml:space="preserve">ChatGPT (code generation</w:t>
-      </w:r>
-      <w:r>
-        <w:t xml:space="preserve"> </w:t>
-      </w:r>
-      <w:r>
-        <w:t xml:space="preserve">review</w:t>
-      </w:r>
-      <w:r>
-        <w:t xml:space="preserve"> </w:t>
-      </w:r>
-      <w:r>
-        <w:t xml:space="preserve">and troubleshooting)</w:t>
-      </w:r>
-    </w:p>
-    <w:bookmarkEnd w:id="21"/>
-    <w:bookmarkStart w:id="22" w:name="work-experience"/>
+        <w:rPr>
+          <w:b/>
+          <w:bCs/>
+        </w:rPr>
+        <w:t xml:space="preserve">Languages:</w:t>
+      </w:r>
+      <w:r>
+        <w:t xml:space="preserve"> </w:t>
+      </w:r>
+      <w:r>
+        <w:t xml:space="preserve">JavaScript/Node.js/TypeScript, HTML, CSS</w:t>
+      </w:r>
+      <w:r>
+        <w:t xml:space="preserve"> </w:t>
+      </w:r>
+      <w:r>
+        <w:rPr>
+          <w:b/>
+          <w:bCs/>
+        </w:rPr>
+        <w:t xml:space="preserve">Front‑end:</w:t>
+      </w:r>
+      <w:r>
+        <w:t xml:space="preserve"> </w:t>
+      </w:r>
+      <w:r>
+        <w:t xml:space="preserve">Svelte/SvelteKit, React, TypeScript/JavaScript, Accessibility (a11y)</w:t>
+      </w:r>
+      <w:r>
+        <w:t xml:space="preserve"> </w:t>
+      </w:r>
+      <w:r>
+        <w:rPr>
+          <w:b/>
+          <w:bCs/>
+        </w:rPr>
+        <w:t xml:space="preserve">Back‑end:</w:t>
+      </w:r>
+      <w:r>
+        <w:t xml:space="preserve"> </w:t>
+      </w:r>
+      <w:r>
+        <w:t xml:space="preserve">Express, Fastify, REST APIs, Webhooks</w:t>
+      </w:r>
+      <w:r>
+        <w:t xml:space="preserve"> </w:t>
+      </w:r>
+      <w:r>
+        <w:rPr>
+          <w:b/>
+          <w:bCs/>
+        </w:rPr>
+        <w:t xml:space="preserve">Data &amp; Storage:</w:t>
+      </w:r>
+      <w:r>
+        <w:t xml:space="preserve"> </w:t>
+      </w:r>
+      <w:r>
+        <w:t xml:space="preserve">MongoDB, PostgreSQL, Supabase, JSON/CSV pipelines</w:t>
+      </w:r>
+      <w:r>
+        <w:t xml:space="preserve"> </w:t>
+      </w:r>
+      <w:r>
+        <w:rPr>
+          <w:b/>
+          <w:bCs/>
+        </w:rPr>
+        <w:t xml:space="preserve">Infra/DevOps:</w:t>
+      </w:r>
+      <w:r>
+        <w:t xml:space="preserve"> </w:t>
+      </w:r>
+      <w:r>
+        <w:t xml:space="preserve">Docker, GitHub Actions, Ubuntu, NGINX, pm2</w:t>
+      </w:r>
+      <w:r>
+        <w:t xml:space="preserve"> </w:t>
+      </w:r>
+      <w:r>
+        <w:rPr>
+          <w:b/>
+          <w:bCs/>
+        </w:rPr>
+        <w:t xml:space="preserve">Testing/Quality:</w:t>
+      </w:r>
+      <w:r>
+        <w:t xml:space="preserve"> </w:t>
+      </w:r>
+      <w:r>
+        <w:t xml:space="preserve">Chai, Karma, Protractor; component patterns; E2E/testable UIs</w:t>
+      </w:r>
+      <w:r>
+        <w:t xml:space="preserve"> </w:t>
+      </w:r>
+      <w:r>
+        <w:rPr>
+          <w:b/>
+          <w:bCs/>
+        </w:rPr>
+        <w:t xml:space="preserve">Web3:</w:t>
+      </w:r>
+      <w:r>
+        <w:t xml:space="preserve"> </w:t>
+      </w:r>
+      <w:r>
+        <w:t xml:space="preserve">Polygon, Ethers.js/web3, NFT utilities, wallet integrations</w:t>
+      </w:r>
+      <w:r>
+        <w:t xml:space="preserve"> </w:t>
+      </w:r>
+      <w:r>
+        <w:rPr>
+          <w:b/>
+          <w:bCs/>
+        </w:rPr>
+        <w:t xml:space="preserve">AI/LLM Tooling:</w:t>
+      </w:r>
+      <w:r>
+        <w:t xml:space="preserve"> </w:t>
+      </w:r>
+      <w:r>
+        <w:t xml:space="preserve">WindSurf, RooCode, Cursor, GitHub Copilot, ChatGPT (code generation, review, and troubleshooting)</w:t>
+      </w:r>
+    </w:p>
+    <w:bookmarkEnd w:id="10"/>
+    <w:bookmarkStart w:id="11" w:name="work-experience"/>
     <w:p>
       <w:pPr>
         <w:pStyle w:val="Heading2"/>
@@ -322,13 +238,13 @@
         <w:pStyle w:val="BodyText"/>
       </w:pPr>
       <w:r>
-        <w:t xml:space="preserve">📅 April 2024 - Present</w:t>
-      </w:r>
-      <w:r>
-        <w:t xml:space="preserve"> </w:t>
-      </w:r>
-      <w:r>
-        <w:t xml:space="preserve">📍 Remote, part-time</w:t>
+        <w:t xml:space="preserve">April 2024 - Present</w:t>
+      </w:r>
+      <w:r>
+        <w:t xml:space="preserve"> </w:t>
+      </w:r>
+      <w:r>
+        <w:t xml:space="preserve">| Remote, part-time</w:t>
       </w:r>
     </w:p>
     <w:p>
@@ -396,13 +312,13 @@
         <w:pStyle w:val="BodyText"/>
       </w:pPr>
       <w:r>
-        <w:t xml:space="preserve">📅 Mar 2018 – part-time</w:t>
-      </w:r>
-      <w:r>
-        <w:t xml:space="preserve"> </w:t>
-      </w:r>
-      <w:r>
-        <w:t xml:space="preserve">📍 Remote</w:t>
+        <w:t xml:space="preserve">Mar 2018 – part-time</w:t>
+      </w:r>
+      <w:r>
+        <w:t xml:space="preserve"> </w:t>
+      </w:r>
+      <w:r>
+        <w:t xml:space="preserve">| Remote</w:t>
       </w:r>
     </w:p>
     <w:p>
@@ -470,13 +386,13 @@
         <w:pStyle w:val="BodyText"/>
       </w:pPr>
       <w:r>
-        <w:t xml:space="preserve">📅 Apr 2021 – Aug 2025</w:t>
-      </w:r>
-      <w:r>
-        <w:t xml:space="preserve"> </w:t>
-      </w:r>
-      <w:r>
-        <w:t xml:space="preserve">📍 Equity‑only, part‑time</w:t>
+        <w:t xml:space="preserve">Apr 2021 – Aug 2025</w:t>
+      </w:r>
+      <w:r>
+        <w:t xml:space="preserve"> </w:t>
+      </w:r>
+      <w:r>
+        <w:t xml:space="preserve">| Equity‑only, part‑time</w:t>
       </w:r>
     </w:p>
     <w:p>
@@ -532,13 +448,13 @@
         <w:pStyle w:val="BodyText"/>
       </w:pPr>
       <w:r>
-        <w:t xml:space="preserve">📅 Mar 2021 – Jan 2022</w:t>
-      </w:r>
-      <w:r>
-        <w:t xml:space="preserve"> </w:t>
-      </w:r>
-      <w:r>
-        <w:t xml:space="preserve">📍 Remote</w:t>
+        <w:t xml:space="preserve">Mar 2021 – Jan 2022</w:t>
+      </w:r>
+      <w:r>
+        <w:t xml:space="preserve"> </w:t>
+      </w:r>
+      <w:r>
+        <w:t xml:space="preserve">| Remote</w:t>
       </w:r>
     </w:p>
     <w:p>
@@ -594,13 +510,13 @@
         <w:pStyle w:val="BodyText"/>
       </w:pPr>
       <w:r>
-        <w:t xml:space="preserve">📅 Nov 2014 – Mar 2018</w:t>
-      </w:r>
-      <w:r>
-        <w:t xml:space="preserve"> </w:t>
-      </w:r>
-      <w:r>
-        <w:t xml:space="preserve">📍 Remote</w:t>
+        <w:t xml:space="preserve">Nov 2014 – Mar 2018</w:t>
+      </w:r>
+      <w:r>
+        <w:t xml:space="preserve"> </w:t>
+      </w:r>
+      <w:r>
+        <w:t xml:space="preserve">| Remote</w:t>
       </w:r>
     </w:p>
     <w:p>
@@ -668,13 +584,13 @@
         <w:pStyle w:val="BodyText"/>
       </w:pPr>
       <w:r>
-        <w:t xml:space="preserve">📅 Dec 2010 - Sept 2013</w:t>
-      </w:r>
-      <w:r>
-        <w:t xml:space="preserve"> </w:t>
-      </w:r>
-      <w:r>
-        <w:t xml:space="preserve">📍 Santa Clara, California, United States</w:t>
+        <w:t xml:space="preserve">Dec 2010 - Sept 2013</w:t>
+      </w:r>
+      <w:r>
+        <w:t xml:space="preserve"> </w:t>
+      </w:r>
+      <w:r>
+        <w:t xml:space="preserve">| Santa Clara, California, United States</w:t>
       </w:r>
     </w:p>
     <w:p>
@@ -742,13 +658,13 @@
         <w:pStyle w:val="BodyText"/>
       </w:pPr>
       <w:r>
-        <w:t xml:space="preserve">📅 Jan 2010 – Dec 2010</w:t>
-      </w:r>
-      <w:r>
-        <w:t xml:space="preserve"> </w:t>
-      </w:r>
-      <w:r>
-        <w:t xml:space="preserve">📍 Sunnyvale, California, United States</w:t>
+        <w:t xml:space="preserve">Jan 2010 – Dec 2010</w:t>
+      </w:r>
+      <w:r>
+        <w:t xml:space="preserve"> </w:t>
+      </w:r>
+      <w:r>
+        <w:t xml:space="preserve">| Sunnyvale, California, United States</w:t>
       </w:r>
     </w:p>
     <w:p>
@@ -804,13 +720,13 @@
         <w:pStyle w:val="BodyText"/>
       </w:pPr>
       <w:r>
-        <w:t xml:space="preserve">📅 Oct 2003 - June 2006</w:t>
-      </w:r>
-      <w:r>
-        <w:t xml:space="preserve"> </w:t>
-      </w:r>
-      <w:r>
-        <w:t xml:space="preserve">📍 San Jose, California, United States</w:t>
+        <w:t xml:space="preserve">Oct 2003 - June 2006</w:t>
+      </w:r>
+      <w:r>
+        <w:t xml:space="preserve"> </w:t>
+      </w:r>
+      <w:r>
+        <w:t xml:space="preserve">| San Jose, California, United States</w:t>
       </w:r>
     </w:p>
     <w:p>
@@ -845,8 +761,8 @@
         <w:t xml:space="preserve">Collaborated closely with the Director of Engineering to align technical</w:t>
       </w:r>
     </w:p>
-    <w:bookmarkEnd w:id="22"/>
-    <w:bookmarkStart w:id="23" w:name="selected-projects"/>
+    <w:bookmarkEnd w:id="11"/>
+    <w:bookmarkStart w:id="14" w:name="selected-projects"/>
     <w:p>
       <w:pPr>
         <w:pStyle w:val="Heading2"/>
@@ -884,8 +800,19 @@
         <w:pStyle w:val="BodyText"/>
       </w:pPr>
       <w:r>
-        <w:t xml:space="preserve">Personal account with AI experiments and JS projects: https://github.com/ralyodio</w:t>
-      </w:r>
+        <w:t xml:space="preserve">Personal account with AI experiments and JS projects:</w:t>
+      </w:r>
+      <w:r>
+        <w:t xml:space="preserve"> </w:t>
+      </w:r>
+      <w:hyperlink r:id="rId12">
+        <w:r>
+          <w:rPr>
+            <w:rStyle w:val="Hyperlink"/>
+          </w:rPr>
+          <w:t xml:space="preserve">https://github.com/ralyodio</w:t>
+        </w:r>
+      </w:hyperlink>
     </w:p>
     <w:p>
       <w:pPr>
@@ -900,11 +827,22 @@
         <w:pStyle w:val="BodyText"/>
       </w:pPr>
       <w:r>
-        <w:t xml:space="preserve">Organization projects: https://github.com/profullstack</w:t>
-      </w:r>
-    </w:p>
-    <w:bookmarkEnd w:id="23"/>
-    <w:bookmarkStart w:id="24" w:name="education"/>
+        <w:t xml:space="preserve">Organization projects:</w:t>
+      </w:r>
+      <w:r>
+        <w:t xml:space="preserve"> </w:t>
+      </w:r>
+      <w:hyperlink r:id="rId13">
+        <w:r>
+          <w:rPr>
+            <w:rStyle w:val="Hyperlink"/>
+          </w:rPr>
+          <w:t xml:space="preserve">https://github.com/profullstack</w:t>
+        </w:r>
+      </w:hyperlink>
+    </w:p>
+    <w:bookmarkEnd w:id="14"/>
+    <w:bookmarkStart w:id="15" w:name="education"/>
     <w:p>
       <w:pPr>
         <w:pStyle w:val="Heading2"/>
@@ -918,19 +856,18 @@
         <w:pStyle w:val="FirstParagraph"/>
       </w:pPr>
       <w:r>
-        <w:t xml:space="preserve">San Diego State University</w:t>
-      </w:r>
-    </w:p>
-    <w:p>
-      <w:pPr>
-        <w:pStyle w:val="BodyText"/>
-      </w:pPr>
-      <w:r>
-        <w:t xml:space="preserve">B.S., Business Administration (1993–1998)</w:t>
-      </w:r>
-    </w:p>
-    <w:bookmarkEnd w:id="24"/>
-    <w:bookmarkStart w:id="28" w:name="additional-highlights"/>
+        <w:t xml:space="preserve">San Diego State University — B.S., Business Administration (1993–1998)</w:t>
+      </w:r>
+    </w:p>
+    <w:p>
+      <w:r>
+        <w:pict>
+          <v:rect style="width:0;height:1.5pt" o:hralign="center" o:hrstd="t" o:hr="t"/>
+        </w:pict>
+      </w:r>
+    </w:p>
+    <w:bookmarkEnd w:id="15"/>
+    <w:bookmarkStart w:id="19" w:name="additional-highlights"/>
     <w:p>
       <w:pPr>
         <w:pStyle w:val="Heading2"/>
@@ -947,7 +884,7 @@
         <w:t xml:space="preserve">🚀</w:t>
       </w:r>
     </w:p>
-    <w:bookmarkStart w:id="25" w:name="aidriven-collaboration"/>
+    <w:bookmarkStart w:id="16" w:name="aidriven-collaboration"/>
     <w:p>
       <w:pPr>
         <w:pStyle w:val="Heading4"/>
@@ -964,7 +901,7 @@
         <w:t xml:space="preserve">Daily use of Cursor, Copilot, and ChatGPT to write, review, and maintain high‑quality JavaScript/Node/Svelte code.</w:t>
       </w:r>
     </w:p>
-    <w:bookmarkEnd w:id="25"/>
+    <w:bookmarkEnd w:id="16"/>
     <w:p>
       <w:pPr>
         <w:pStyle w:val="BodyText"/>
@@ -973,7 +910,7 @@
         <w:t xml:space="preserve">⚡</w:t>
       </w:r>
     </w:p>
-    <w:bookmarkStart w:id="26" w:name="mentorship-standards"/>
+    <w:bookmarkStart w:id="17" w:name="mentorship-standards"/>
     <w:p>
       <w:pPr>
         <w:pStyle w:val="Heading4"/>
@@ -990,7 +927,7 @@
         <w:t xml:space="preserve">Guides teams in prompt strategy, AI‑assisted reviews, component patterns, and maintainable architectures.</w:t>
       </w:r>
     </w:p>
-    <w:bookmarkEnd w:id="26"/>
+    <w:bookmarkEnd w:id="17"/>
     <w:p>
       <w:pPr>
         <w:pStyle w:val="BodyText"/>
@@ -999,7 +936,7 @@
         <w:t xml:space="preserve">💎</w:t>
       </w:r>
     </w:p>
-    <w:bookmarkStart w:id="27" w:name="remotefirst"/>
+    <w:bookmarkStart w:id="18" w:name="remotefirst"/>
     <w:p>
       <w:pPr>
         <w:pStyle w:val="Heading4"/>
@@ -1016,9 +953,13 @@
         <w:t xml:space="preserve">Strong async communication, agile delivery, and documentation practices across distributed teams.</w:t>
       </w:r>
     </w:p>
-    <w:bookmarkEnd w:id="27"/>
-    <w:bookmarkEnd w:id="28"/>
-    <w:sectPr/>
+    <w:bookmarkEnd w:id="18"/>
+    <w:bookmarkEnd w:id="19"/>
+    <w:sectPr>
+      <w:footnotePr>
+        <w:numRestart w:val="eachSect"/>
+      </w:footnotePr>
+    </w:sectPr>
   </w:body>
 </w:document>
 </file>
@@ -1317,8 +1258,6 @@
     </w:pPr>
     <w:rPr>
       <w:rFonts w:asciiTheme="majorHAnsi" w:cstheme="majorBidi" w:eastAsiaTheme="majorEastAsia" w:hAnsiTheme="majorHAnsi"/>
-      <w:spacing w:val="-10"/>
-      <w:kern w:val="28"/>
       <w:sz w:val="56"/>
       <w:szCs w:val="56"/>
     </w:rPr>
@@ -1331,8 +1270,6 @@
     <w:rsid w:val="00A10FD9"/>
     <w:rPr>
       <w:rFonts w:asciiTheme="majorHAnsi" w:cstheme="majorBidi" w:eastAsiaTheme="majorEastAsia" w:hAnsiTheme="majorHAnsi"/>
-      <w:spacing w:val="-10"/>
-      <w:kern w:val="28"/>
       <w:sz w:val="56"/>
       <w:szCs w:val="56"/>
     </w:rPr>
@@ -1373,23 +1310,31 @@
   </w:style>
   <w:style w:customStyle="1" w:styleId="Author" w:type="paragraph">
     <w:name w:val="Author"/>
+    <w:basedOn w:val="Title"/>
     <w:next w:val="BodyText"/>
     <w:qFormat/>
     <w:pPr>
       <w:keepNext/>
       <w:keepLines/>
-      <w:jc w:val="center"/>
-    </w:pPr>
+    </w:pPr>
+    <w:rPr>
+      <w:sz w:val="24"/>
+      <w:szCs w:val="24"/>
+    </w:rPr>
   </w:style>
   <w:style w:styleId="Date" w:type="paragraph">
     <w:name w:val="Date"/>
+    <w:basedOn w:val="Title"/>
     <w:next w:val="BodyText"/>
     <w:qFormat/>
     <w:pPr>
       <w:keepNext/>
       <w:keepLines/>
-      <w:jc w:val="center"/>
-    </w:pPr>
+    </w:pPr>
+    <w:rPr>
+      <w:sz w:val="24"/>
+      <w:szCs w:val="24"/>
+    </w:rPr>
   </w:style>
   <w:style w:customStyle="1" w:styleId="AbstractTitle" w:type="paragraph">
     <w:name w:val="Abstract Title"/>

</xml_diff>